<commit_message>
Werk ketenafstemming en overdrachtsdocument bij
</commit_message>
<xml_diff>
--- a/downloads/overdrachtsdocument.docx
+++ b/downloads/overdrachtsdocument.docx
@@ -1,6 +1,6 @@
 
-<file path=word/document.xml><?xml version="1.0" encoding="utf-8"?>
-<w:document xmlns:w="http://schemas.openxmlformats.org/wordprocessingml/2006/main">
+<file path=word\document.xml><?xml version="1.0" encoding="utf-8"?>
+<w:document xmlns:w="http://schemas.openxmlformats.org/wordprocessingml/2006/main" xmlns:r="http://schemas.openxmlformats.org/officeDocument/2006/relationships">
   <w:body>
     <w:p>
       <w:pPr>
@@ -110,7 +110,7 @@
     </w:p>
     <w:p>
       <w:r>
-        <w:t>Met dit document wordt het bovengenoemde proces opgenomen in het zaaksysteem.</w:t>
+        <w:t>Met dit document wordt het proces opgenomen in het zaaksysteem.</w:t>
       </w:r>
     </w:p>
     <w:p/>
@@ -247,7 +247,7 @@
         <w:tc>
           <w:p>
             <w:r>
-              <w:t>Informatiebeheer</w:t>
+              <w:t>Taakveld DIV (adviseur recordmanagement)</w:t>
             </w:r>
           </w:p>
         </w:tc>
@@ -261,7 +261,7 @@
     </w:p>
     <w:p>
       <w:r>
-        <w:t>De archivering in het zaaksysteem valt onder de verantwoordelijkheid van Informatiebeheer. De business blijft verantwoordelijk voor de inhoud van de processen.</w:t>
+        <w:t>De archivering in het zaaksysteem valt onder de verantwoordelijkheid van Taakveld DIV. De business blijft verantwoordelijk voor de inhoud van de processen.</w:t>
       </w:r>
     </w:p>
     <w:p/>
@@ -540,84 +540,31 @@
 </w:document>
 </file>
 
-<file path=word/comments.xml><?xml version="1.0" encoding="utf-8"?>
-<w:comments xmlns:w14="http://schemas.microsoft.com/office/word/2010/wordml" xmlns:w="http://schemas.openxmlformats.org/wordprocessingml/2006/main">
-  <w:comment xmlns:w="http://schemas.openxmlformats.org/wordprocessingml/2006/main" w:initials="LR" w:author="Liu, RBLKJ (Robert)" w:date="2025-11-14T14:22:32" w:id="1260691105">
-    <w:p xmlns:w14="http://schemas.microsoft.com/office/word/2010/wordml" xmlns:w="http://schemas.openxmlformats.org/wordprocessingml/2006/main">
-      <w:pPr>
-        <w:pStyle w:val="CommentText"/>
-      </w:pPr>
-      <w:r>
-        <w:rPr>
-          <w:rStyle w:val="CommentReference"/>
-        </w:rPr>
-        <w:annotationRef/>
-      </w:r>
-      <w:r>
-        <w:t>Deze actie ligt bij de functioneel beheerder van SIM!</w:t>
-      </w:r>
-    </w:p>
-  </w:comment>
-  <w:comment xmlns:w="http://schemas.openxmlformats.org/wordprocessingml/2006/main" w:initials="TA" w:author="Tump, AW (Arne)" w:date="2025-11-24T11:54:54" w:id="743212167">
-    <w:p xmlns:w14="http://schemas.microsoft.com/office/word/2010/wordml" xmlns:w="http://schemas.openxmlformats.org/wordprocessingml/2006/main">
-      <w:pPr>
-        <w:pStyle w:val="CommentText"/>
-      </w:pPr>
-      <w:r>
-        <w:rPr>
-          <w:rStyle w:val="CommentReference"/>
-        </w:rPr>
-        <w:annotationRef/>
-      </w:r>
-      <w:r>
-        <w:t>Dat doen jullie toch zelf?</w:t>
-      </w:r>
-    </w:p>
-  </w:comment>
-  <w:comment xmlns:w="http://schemas.openxmlformats.org/wordprocessingml/2006/main" w:initials="TA" w:author="Tump, AW (Arne)" w:date="2026-01-27T10:33:02" w:id="1400785423">
-    <w:p xmlns:w14="http://schemas.microsoft.com/office/word/2010/wordml" xmlns:w="http://schemas.openxmlformats.org/wordprocessingml/2006/main">
-      <w:pPr>
-        <w:pStyle w:val="CommentText"/>
-      </w:pPr>
-      <w:r>
-        <w:rPr>
-          <w:rStyle w:val="CommentReference"/>
-        </w:rPr>
-        <w:annotationRef/>
-      </w:r>
-      <w:r>
-        <w:t>Robert en Lisha overleggen nog even over hoe dit gaat met Norbert.</w:t>
-      </w:r>
-    </w:p>
-  </w:comment>
-</w:comments>
+<file path=word\fontTable.xml><?xml version="1.0" encoding="utf-8"?>
+<w:fonts xmlns:mc="http://schemas.openxmlformats.org/markup-compatibility/2006" xmlns:r="http://schemas.openxmlformats.org/officeDocument/2006/relationships" xmlns:w="http://schemas.openxmlformats.org/wordprocessingml/2006/main" xmlns:w14="http://schemas.microsoft.com/office/word/2010/wordml" xmlns:w15="http://schemas.microsoft.com/office/word/2012/wordml" xmlns:w16cex="http://schemas.microsoft.com/office/word/2018/wordml/cex" xmlns:w16cid="http://schemas.microsoft.com/office/word/2016/wordml/cid" xmlns:w16="http://schemas.microsoft.com/office/word/2018/wordml" xmlns:w16du="http://schemas.microsoft.com/office/word/2023/wordml/word16du" xmlns:w16sdtdh="http://schemas.microsoft.com/office/word/2020/wordml/sdtdatahash" xmlns:w16sdtfl="http://schemas.microsoft.com/office/word/2024/wordml/sdtformatlock" xmlns:w16se="http://schemas.microsoft.com/office/word/2015/wordml/symex" mc:Ignorable="w14 w15 w16se w16cid w16 w16cex w16sdtdh w16sdtfl w16du">
+  <w:font w:name="Times New Roman">
+    <w:panose1 w:val="02020603050405020304"/>
+    <w:charset w:val="00"/>
+    <w:family w:val="roman"/>
+    <w:pitch w:val="variable"/>
+    <w:sig w:usb0="E0002EFF" w:usb1="C000785B" w:usb2="00000009" w:usb3="00000000" w:csb0="000001FF" w:csb1="00000000"/>
+  </w:font>
+  <w:font w:name="Aptos">
+    <w:charset w:val="00"/>
+    <w:family w:val="swiss"/>
+    <w:pitch w:val="variable"/>
+    <w:sig w:usb0="20000287" w:usb1="00000003" w:usb2="00000000" w:usb3="00000000" w:csb0="0000019F" w:csb1="00000000"/>
+  </w:font>
+  <w:font w:name="Aptos Display">
+    <w:charset w:val="00"/>
+    <w:family w:val="swiss"/>
+    <w:pitch w:val="variable"/>
+    <w:sig w:usb0="20000287" w:usb1="00000003" w:usb2="00000000" w:usb3="00000000" w:csb0="0000019F" w:csb1="00000000"/>
+  </w:font>
+</w:fonts>
 </file>
 
-<file path=word/commentsExtended.xml><?xml version="1.0" encoding="utf-8"?>
-<w15:commentsEx xmlns:mc="http://schemas.openxmlformats.org/markup-compatibility/2006" xmlns:w15="http://schemas.microsoft.com/office/word/2012/wordml" mc:Ignorable="w15">
-  <w15:commentEx w15:done="0" w15:paraId="1A9AFF34"/>
-  <w15:commentEx w15:done="0" w15:paraId="0AC9F38B" w15:paraIdParent="1A9AFF34"/>
-  <w15:commentEx w15:done="0" w15:paraId="70590919" w15:paraIdParent="1A9AFF34"/>
-</w15:commentsEx>
-</file>
-
-<file path=word/commentsExtensible.xml><?xml version="1.0" encoding="utf-8"?>
-<w16cex:commentsExtensible xmlns:w16="http://schemas.microsoft.com/office/word/2018/wordml" xmlns:w16cex="http://schemas.microsoft.com/office/word/2018/wordml/cex" xmlns:mc="http://schemas.openxmlformats.org/markup-compatibility/2006" mc:Ignorable="w16 w16cex">
-  <w16cex:commentExtensible w16cex:durableId="6F5A4C0F" w16cex:dateUtc="2026-01-27T09:33:02.105Z"/>
-  <w16cex:commentExtensible w16cex:durableId="63AAFA6D" w16cex:dateUtc="2025-11-24T10:54:54.89Z"/>
-  <w16cex:commentExtensible w16cex:durableId="480B8F81" w16cex:dateUtc="2025-11-14T13:22:32.465Z"/>
-</w16cex:commentsExtensible>
-</file>
-
-<file path=word/commentsIds.xml><?xml version="1.0" encoding="utf-8"?>
-<w16cid:commentsIds xmlns:mc="http://schemas.openxmlformats.org/markup-compatibility/2006" xmlns:w16cid="http://schemas.microsoft.com/office/word/2016/wordml/cid" mc:Ignorable="w16cid">
-  <w16cid:commentId w16cid:paraId="1A9AFF34" w16cid:durableId="480B8F81"/>
-  <w16cid:commentId w16cid:paraId="0AC9F38B" w16cid:durableId="63AAFA6D"/>
-  <w16cid:commentId w16cid:paraId="70590919" w16cid:durableId="6F5A4C0F"/>
-</w16cid:commentsIds>
-</file>
-
-<file path=word/numbering.xml><?xml version="1.0" encoding="utf-8"?>
+<file path=word\numbering.xml><?xml version="1.0" encoding="utf-8"?>
 <w:numbering xmlns:wpc="http://schemas.microsoft.com/office/word/2010/wordprocessingCanvas" xmlns:cx="http://schemas.microsoft.com/office/drawing/2014/chartex" xmlns:cx1="http://schemas.microsoft.com/office/drawing/2015/9/8/chartex" xmlns:cx2="http://schemas.microsoft.com/office/drawing/2015/10/21/chartex" xmlns:cx3="http://schemas.microsoft.com/office/drawing/2016/5/9/chartex" xmlns:cx4="http://schemas.microsoft.com/office/drawing/2016/5/10/chartex" xmlns:cx5="http://schemas.microsoft.com/office/drawing/2016/5/11/chartex" xmlns:cx6="http://schemas.microsoft.com/office/drawing/2016/5/12/chartex" xmlns:cx7="http://schemas.microsoft.com/office/drawing/2016/5/13/chartex" xmlns:cx8="http://schemas.microsoft.com/office/drawing/2016/5/14/chartex" xmlns:mc="http://schemas.openxmlformats.org/markup-compatibility/2006" xmlns:aink="http://schemas.microsoft.com/office/drawing/2016/ink" xmlns:am3d="http://schemas.microsoft.com/office/drawing/2017/model3d" xmlns:o="urn:schemas-microsoft-com:office:office" xmlns:oel="http://schemas.microsoft.com/office/2019/extlst" xmlns:r="http://schemas.openxmlformats.org/officeDocument/2006/relationships" xmlns:m="http://schemas.openxmlformats.org/officeDocument/2006/math" xmlns:v="urn:schemas-microsoft-com:vml" xmlns:wp14="http://schemas.microsoft.com/office/word/2010/wordprocessingDrawing" xmlns:wp="http://schemas.openxmlformats.org/drawingml/2006/wordprocessingDrawing" xmlns:w10="urn:schemas-microsoft-com:office:word" xmlns:w="http://schemas.openxmlformats.org/wordprocessingml/2006/main" xmlns:w14="http://schemas.microsoft.com/office/word/2010/wordml" xmlns:w15="http://schemas.microsoft.com/office/word/2012/wordml" xmlns:w16cex="http://schemas.microsoft.com/office/word/2018/wordml/cex" xmlns:w16cid="http://schemas.microsoft.com/office/word/2016/wordml/cid" xmlns:w16="http://schemas.microsoft.com/office/word/2018/wordml" xmlns:w16du="http://schemas.microsoft.com/office/word/2023/wordml/word16du" xmlns:w16sdtdh="http://schemas.microsoft.com/office/word/2020/wordml/sdtdatahash" xmlns:w16sdtfl="http://schemas.microsoft.com/office/word/2024/wordml/sdtformatlock" xmlns:w16se="http://schemas.microsoft.com/office/word/2015/wordml/symex" xmlns:wpg="http://schemas.microsoft.com/office/word/2010/wordprocessingGroup" xmlns:wpi="http://schemas.microsoft.com/office/word/2010/wordprocessingInk" xmlns:wne="http://schemas.microsoft.com/office/word/2006/wordml" xmlns:wps="http://schemas.microsoft.com/office/word/2010/wordprocessingShape" mc:Ignorable="w14 w15 w16se w16cid w16 w16cex w16sdtdh w16sdtfl w16du wp14">
   <w:abstractNum w:abstractNumId="0" w15:restartNumberingAfterBreak="0">
     <w:nsid w:val="75FE605D"/>
@@ -765,21 +712,170 @@
 </w:numbering>
 </file>
 
-<file path=word/people.xml><?xml version="1.0" encoding="utf-8"?>
-<w15:people xmlns:mc="http://schemas.openxmlformats.org/markup-compatibility/2006" xmlns:w15="http://schemas.microsoft.com/office/word/2012/wordml" mc:Ignorable="w15">
-  <w15:person w15:author="Tump, AW (Arne)">
-    <w15:presenceInfo w15:providerId="AD" w15:userId="S::awtump@gemeentewestland.nl::9812c181-033f-4b08-b8b3-d67005e352f3"/>
-  </w15:person>
-  <w15:person w15:author="Liu, RBLKJ (Robert)">
-    <w15:presenceInfo w15:providerId="AD" w15:userId="S::rblkjliu@gemeentewestland.nl::30f1ce90-e896-44ab-96f5-74de62a35b82"/>
-  </w15:person>
-  <w15:person w15:author="Liu, RBLKJ (Robert)">
-    <w15:presenceInfo w15:providerId="AD" w15:userId="S::rblkjliu@gemeentewestland.nl::30f1ce90-e896-44ab-96f5-74de62a35b82"/>
-  </w15:person>
-</w15:people>
+<file path=word\settings.xml><?xml version="1.0" encoding="utf-8"?>
+<w:settings xmlns:mc="http://schemas.openxmlformats.org/markup-compatibility/2006" xmlns:o="urn:schemas-microsoft-com:office:office" xmlns:r="http://schemas.openxmlformats.org/officeDocument/2006/relationships" xmlns:m="http://schemas.openxmlformats.org/officeDocument/2006/math" xmlns:v="urn:schemas-microsoft-com:vml" xmlns:w10="urn:schemas-microsoft-com:office:word" xmlns:w="http://schemas.openxmlformats.org/wordprocessingml/2006/main" xmlns:w14="http://schemas.microsoft.com/office/word/2010/wordml" xmlns:w15="http://schemas.microsoft.com/office/word/2012/wordml" xmlns:w16cex="http://schemas.microsoft.com/office/word/2018/wordml/cex" xmlns:w16cid="http://schemas.microsoft.com/office/word/2016/wordml/cid" xmlns:w16="http://schemas.microsoft.com/office/word/2018/wordml" xmlns:w16du="http://schemas.microsoft.com/office/word/2023/wordml/word16du" xmlns:w16sdtdh="http://schemas.microsoft.com/office/word/2020/wordml/sdtdatahash" xmlns:w16sdtfl="http://schemas.microsoft.com/office/word/2024/wordml/sdtformatlock" xmlns:w16se="http://schemas.microsoft.com/office/word/2015/wordml/symex" xmlns:sl="http://schemas.openxmlformats.org/schemaLibrary/2006/main" mc:Ignorable="w14 w15 w16se w16cid w16 w16cex w16sdtdh w16sdtfl w16du">
+  <w:zoom w:percent="100"/>
+  <w:trackRevisions w:val="false"/>
+  <w:defaultTabStop w:val="708"/>
+  <w:hyphenationZone w:val="425"/>
+  <w:characterSpacingControl w:val="doNotCompress"/>
+  <w:compat>
+    <w:compatSetting w:name="compatibilityMode" w:uri="http://schemas.microsoft.com/office/word" w:val="15"/>
+    <w:compatSetting w:name="overrideTableStyleFontSizeAndJustification" w:uri="http://schemas.microsoft.com/office/word" w:val="1"/>
+    <w:compatSetting w:name="enableOpenTypeFeatures" w:uri="http://schemas.microsoft.com/office/word" w:val="1"/>
+    <w:compatSetting w:name="doNotFlipMirrorIndents" w:uri="http://schemas.microsoft.com/office/word" w:val="1"/>
+    <w:compatSetting w:name="differentiateMultirowTableHeaders" w:uri="http://schemas.microsoft.com/office/word" w:val="1"/>
+    <w:compatSetting w:name="useWord2013TrackBottomHyphenation" w:uri="http://schemas.microsoft.com/office/word" w:val="0"/>
+  </w:compat>
+  <w:rsids>
+    <w:rsidRoot w:val="00A8515A"/>
+    <w:rsid w:val="001F51E9"/>
+    <w:rsid w:val="008533D5"/>
+    <w:rsid w:val="00A8515A"/>
+    <w:rsid w:val="00C56298"/>
+    <w:rsid w:val="0240A5B9"/>
+    <w:rsid w:val="046D39D6"/>
+    <w:rsid w:val="04F353AA"/>
+    <w:rsid w:val="066FC8FE"/>
+    <w:rsid w:val="072793CA"/>
+    <w:rsid w:val="094B47F2"/>
+    <w:rsid w:val="097D37C9"/>
+    <w:rsid w:val="0C53753D"/>
+    <w:rsid w:val="0C53753D"/>
+    <w:rsid w:val="0CEEDBFE"/>
+    <w:rsid w:val="0E40DB9F"/>
+    <w:rsid w:val="0E604677"/>
+    <w:rsid w:val="1222A7A1"/>
+    <w:rsid w:val="13EDCA80"/>
+    <w:rsid w:val="13EDCA80"/>
+    <w:rsid w:val="143C6983"/>
+    <w:rsid w:val="14A64E83"/>
+    <w:rsid w:val="15045C93"/>
+    <w:rsid w:val="1667CD5B"/>
+    <w:rsid w:val="172B5C16"/>
+    <w:rsid w:val="18C25C6A"/>
+    <w:rsid w:val="18E26679"/>
+    <w:rsid w:val="19177115"/>
+    <w:rsid w:val="1B4C4BFE"/>
+    <w:rsid w:val="1CE17364"/>
+    <w:rsid w:val="1FEEE7BD"/>
+    <w:rsid w:val="24FE411A"/>
+    <w:rsid w:val="265F7A4B"/>
+    <w:rsid w:val="279F4326"/>
+    <w:rsid w:val="2CB1890C"/>
+    <w:rsid w:val="2E26975A"/>
+    <w:rsid w:val="2FD7F75A"/>
+    <w:rsid w:val="31AFF437"/>
+    <w:rsid w:val="3305B7F5"/>
+    <w:rsid w:val="3470EE0D"/>
+    <w:rsid w:val="36341949"/>
+    <w:rsid w:val="3662F102"/>
+    <w:rsid w:val="36E9F2CD"/>
+    <w:rsid w:val="373020A9"/>
+    <w:rsid w:val="374C5CE0"/>
+    <w:rsid w:val="37DEBD76"/>
+    <w:rsid w:val="389F6CF4"/>
+    <w:rsid w:val="3A69C254"/>
+    <w:rsid w:val="3D666816"/>
+    <w:rsid w:val="3E1E047C"/>
+    <w:rsid w:val="3E6204E3"/>
+    <w:rsid w:val="3F8E08A4"/>
+    <w:rsid w:val="406FD89B"/>
+    <w:rsid w:val="4272CE6D"/>
+    <w:rsid w:val="438C60EC"/>
+    <w:rsid w:val="43B9A4BE"/>
+    <w:rsid w:val="43E36559"/>
+    <w:rsid w:val="45A5B0AE"/>
+    <w:rsid w:val="47AC8A7B"/>
+    <w:rsid w:val="48C533BF"/>
+    <w:rsid w:val="4B01BB6B"/>
+    <w:rsid w:val="4BED6CCC"/>
+    <w:rsid w:val="4C5AD3B3"/>
+    <w:rsid w:val="4CC763D7"/>
+    <w:rsid w:val="4E0732F2"/>
+    <w:rsid w:val="4F95D0FF"/>
+    <w:rsid w:val="5152B36B"/>
+    <w:rsid w:val="536381A0"/>
+    <w:rsid w:val="5441594F"/>
+    <w:rsid w:val="5694C5FC"/>
+    <w:rsid w:val="5694C5FC"/>
+    <w:rsid w:val="56C27BEB"/>
+    <w:rsid w:val="570BFC55"/>
+    <w:rsid w:val="573DD2A0"/>
+    <w:rsid w:val="57B2AF40"/>
+    <w:rsid w:val="58CA1E68"/>
+    <w:rsid w:val="59D8E440"/>
+    <w:rsid w:val="5A184510"/>
+    <w:rsid w:val="5EB9B6CA"/>
+    <w:rsid w:val="5F14B910"/>
+    <w:rsid w:val="60614F39"/>
+    <w:rsid w:val="6082E91F"/>
+    <w:rsid w:val="61827BFB"/>
+    <w:rsid w:val="627A01AE"/>
+    <w:rsid w:val="628AF2D7"/>
+    <w:rsid w:val="663F34C4"/>
+    <w:rsid w:val="667BCFDC"/>
+    <w:rsid w:val="67FCE5D5"/>
+    <w:rsid w:val="680798D3"/>
+    <w:rsid w:val="68816F07"/>
+    <w:rsid w:val="69110E9B"/>
+    <w:rsid w:val="69C0AE70"/>
+    <w:rsid w:val="6A4C84E2"/>
+    <w:rsid w:val="6B223895"/>
+    <w:rsid w:val="6B9BC617"/>
+    <w:rsid w:val="6BD98DB6"/>
+    <w:rsid w:val="6CCD3371"/>
+    <w:rsid w:val="6D0C9C29"/>
+    <w:rsid w:val="6D98E959"/>
+    <w:rsid w:val="6FE125B1"/>
+    <w:rsid w:val="71762ED1"/>
+    <w:rsid w:val="71AB319E"/>
+    <w:rsid w:val="71AB530C"/>
+    <w:rsid w:val="730B5F51"/>
+    <w:rsid w:val="7498209C"/>
+    <w:rsid w:val="7562E2ED"/>
+    <w:rsid w:val="75918B72"/>
+    <w:rsid w:val="75B4D93A"/>
+    <w:rsid w:val="7702DDB7"/>
+    <w:rsid w:val="77D5B165"/>
+    <w:rsid w:val="78C8006E"/>
+    <w:rsid w:val="78F2FA58"/>
+    <w:rsid w:val="79FE60EA"/>
+    <w:rsid w:val="7AA55CF1"/>
+    <w:rsid w:val="7C3508DE"/>
+    <w:rsid w:val="7C486CD8"/>
+    <w:rsid w:val="7D960258"/>
+  </w:rsids>
+  <m:mathPr>
+    <m:mathFont m:val="Cambria Math"/>
+    <m:brkBin m:val="before"/>
+    <m:brkBinSub m:val="--"/>
+    <m:smallFrac m:val="0"/>
+    <m:dispDef/>
+    <m:lMargin m:val="0"/>
+    <m:rMargin m:val="0"/>
+    <m:defJc m:val="centerGroup"/>
+    <m:wrapIndent m:val="1440"/>
+    <m:intLim m:val="subSup"/>
+    <m:naryLim m:val="undOvr"/>
+  </m:mathPr>
+  <w:themeFontLang w:val="nl-NL"/>
+  <w:clrSchemeMapping w:bg1="light1" w:t1="dark1" w:bg2="light2" w:t2="dark2" w:accent1="accent1" w:accent2="accent2" w:accent3="accent3" w:accent4="accent4" w:accent5="accent5" w:accent6="accent6" w:hyperlink="hyperlink" w:followedHyperlink="followedHyperlink"/>
+  <w:shapeDefaults>
+    <o:shapedefaults v:ext="edit" spidmax="1026"/>
+    <o:shapelayout v:ext="edit">
+      <o:idmap v:ext="edit" data="1"/>
+    </o:shapelayout>
+  </w:shapeDefaults>
+  <w:decimalSymbol w:val=","/>
+  <w:listSeparator w:val=";"/>
+  <w14:docId w14:val="771C7B72"/>
+  <w15:chartTrackingRefBased/>
+  <w15:docId w15:val="{824C6802-539A-4E8B-95B5-C342E8506BCA}"/>
+</w:settings>
 </file>
 
-<file path=word/styles.xml><?xml version="1.0" encoding="utf-8"?>
+<file path=word\styles.xml><?xml version="1.0" encoding="utf-8"?>
 <w:styles xmlns:mc="http://schemas.openxmlformats.org/markup-compatibility/2006" xmlns:r="http://schemas.openxmlformats.org/officeDocument/2006/relationships" xmlns:w="http://schemas.openxmlformats.org/wordprocessingml/2006/main" xmlns:w14="http://schemas.microsoft.com/office/word/2010/wordml" xmlns:w15="http://schemas.microsoft.com/office/word/2012/wordml" xmlns:w16cex="http://schemas.microsoft.com/office/word/2018/wordml/cex" xmlns:w16cid="http://schemas.microsoft.com/office/word/2016/wordml/cid" xmlns:w16="http://schemas.microsoft.com/office/word/2018/wordml" xmlns:w16du="http://schemas.microsoft.com/office/word/2023/wordml/word16du" xmlns:w16sdtdh="http://schemas.microsoft.com/office/word/2020/wordml/sdtdatahash" xmlns:w16sdtfl="http://schemas.microsoft.com/office/word/2024/wordml/sdtformatlock" xmlns:w16se="http://schemas.microsoft.com/office/word/2015/wordml/symex" mc:Ignorable="w14 w15 w16se w16cid w16 w16cex w16sdtdh w16sdtfl w16du">
   <w:docDefaults>
     <w:rPrDefault>
@@ -1698,7 +1794,7 @@
 </w:styles>
 </file>
 
-<file path=word/theme/theme1.xml><?xml version="1.0" encoding="utf-8"?>
+<file path=word\theme\theme1.xml><?xml version="1.0" encoding="utf-8"?>
 <a:theme xmlns:a="http://schemas.openxmlformats.org/drawingml/2006/main" xmlns:thm15="http://schemas.microsoft.com/office/thememl/2012/main" name="Kantoorthema">
   <a:themeElements>
     <a:clrScheme name="Office">
@@ -2013,183 +2109,9 @@
 </a:theme>
 </file>
 
-<file path=customXml/item1.xml><?xml version="1.0" encoding="utf-8"?>
-<ct:contentTypeSchema xmlns:ct="http://schemas.microsoft.com/office/2006/metadata/contentType" xmlns:ma="http://schemas.microsoft.com/office/2006/metadata/properties/metaAttributes" ct:_="" ma:_="" ma:contentTypeName="Document" ma:contentTypeID="0x010100CC973EC7BDECC44CB1D1C057C7F07D31" ma:contentTypeVersion="3" ma:contentTypeDescription="Een nieuw document maken." ma:contentTypeScope="" ma:versionID="43fbe60f97a204d686848fbd12d728bd">
-  <xsd:schema xmlns:xsd="http://www.w3.org/2001/XMLSchema" xmlns:xs="http://www.w3.org/2001/XMLSchema" xmlns:p="http://schemas.microsoft.com/office/2006/metadata/properties" xmlns:ns2="b94d903d-1cee-4c3a-abd3-1183df9b5325" targetNamespace="http://schemas.microsoft.com/office/2006/metadata/properties" ma:root="true" ma:fieldsID="2bd1ae4b854ef2f47f4ed7447876de6e" ns2:_="">
-    <xsd:import namespace="b94d903d-1cee-4c3a-abd3-1183df9b5325"/>
-    <xsd:element name="properties">
-      <xsd:complexType>
-        <xsd:sequence>
-          <xsd:element name="documentManagement">
-            <xsd:complexType>
-              <xsd:all>
-                <xsd:element ref="ns2:MediaServiceMetadata" minOccurs="0"/>
-                <xsd:element ref="ns2:MediaServiceFastMetadata" minOccurs="0"/>
-                <xsd:element ref="ns2:MediaServiceSearchProperties" minOccurs="0"/>
-              </xsd:all>
-            </xsd:complexType>
-          </xsd:element>
-        </xsd:sequence>
-      </xsd:complexType>
-    </xsd:element>
-  </xsd:schema>
-  <xsd:schema xmlns:xsd="http://www.w3.org/2001/XMLSchema" xmlns:xs="http://www.w3.org/2001/XMLSchema" xmlns:dms="http://schemas.microsoft.com/office/2006/documentManagement/types" xmlns:pc="http://schemas.microsoft.com/office/infopath/2007/PartnerControls" targetNamespace="b94d903d-1cee-4c3a-abd3-1183df9b5325" elementFormDefault="qualified">
-    <xsd:import namespace="http://schemas.microsoft.com/office/2006/documentManagement/types"/>
-    <xsd:import namespace="http://schemas.microsoft.com/office/infopath/2007/PartnerControls"/>
-    <xsd:element name="MediaServiceMetadata" ma:index="8" nillable="true" ma:displayName="MediaServiceMetadata" ma:hidden="true" ma:internalName="MediaServiceMetadata" ma:readOnly="true">
-      <xsd:simpleType>
-        <xsd:restriction base="dms:Note"/>
-      </xsd:simpleType>
-    </xsd:element>
-    <xsd:element name="MediaServiceFastMetadata" ma:index="9" nillable="true" ma:displayName="MediaServiceFastMetadata" ma:hidden="true" ma:internalName="MediaServiceFastMetadata" ma:readOnly="true">
-      <xsd:simpleType>
-        <xsd:restriction base="dms:Note"/>
-      </xsd:simpleType>
-    </xsd:element>
-    <xsd:element name="MediaServiceSearchProperties" ma:index="10" nillable="true" ma:displayName="MediaServiceSearchProperties" ma:hidden="true" ma:internalName="MediaServiceSearchProperties" ma:readOnly="true">
-      <xsd:simpleType>
-        <xsd:restriction base="dms:Note"/>
-      </xsd:simpleType>
-    </xsd:element>
-  </xsd:schema>
-  <xsd:schema xmlns="http://schemas.openxmlformats.org/package/2006/metadata/core-properties" xmlns:xsd="http://www.w3.org/2001/XMLSchema" xmlns:xsi="http://www.w3.org/2001/XMLSchema-instance" xmlns:dc="http://purl.org/dc/elements/1.1/" xmlns:dcterms="http://purl.org/dc/terms/" xmlns:odoc="http://schemas.microsoft.com/internal/obd" targetNamespace="http://schemas.openxmlformats.org/package/2006/metadata/core-properties" elementFormDefault="qualified" attributeFormDefault="unqualified" blockDefault="#all">
-    <xsd:import namespace="http://purl.org/dc/elements/1.1/" schemaLocation="http://dublincore.org/schemas/xmls/qdc/2003/04/02/dc.xsd"/>
-    <xsd:import namespace="http://purl.org/dc/terms/" schemaLocation="http://dublincore.org/schemas/xmls/qdc/2003/04/02/dcterms.xsd"/>
-    <xsd:element name="coreProperties" type="CT_coreProperties"/>
-    <xsd:complexType name="CT_coreProperties">
-      <xsd:all>
-        <xsd:element ref="dc:creator" minOccurs="0" maxOccurs="1"/>
-        <xsd:element ref="dcterms:created" minOccurs="0" maxOccurs="1"/>
-        <xsd:element ref="dc:identifier" minOccurs="0" maxOccurs="1"/>
-        <xsd:element name="contentType" minOccurs="0" maxOccurs="1" type="xsd:string" ma:index="0" ma:displayName="Inhoudstype"/>
-        <xsd:element ref="dc:title" minOccurs="0" maxOccurs="1" ma:index="4" ma:displayName="Titel"/>
-        <xsd:element ref="dc:subject" minOccurs="0" maxOccurs="1"/>
-        <xsd:element ref="dc:description" minOccurs="0" maxOccurs="1"/>
-        <xsd:element name="keywords" minOccurs="0" maxOccurs="1" type="xsd:string"/>
-        <xsd:element ref="dc:language" minOccurs="0" maxOccurs="1"/>
-        <xsd:element name="category" minOccurs="0" maxOccurs="1" type="xsd:string"/>
-        <xsd:element name="version" minOccurs="0" maxOccurs="1" type="xsd:string"/>
-        <xsd:element name="revision" minOccurs="0" maxOccurs="1" type="xsd:string">
-          <xsd:annotation>
-            <xsd:documentation>
-                        This value indicates the number of saves or revisions. The application is responsible for updating this value after each revision.
-                    </xsd:documentation>
-          </xsd:annotation>
-        </xsd:element>
-        <xsd:element name="lastModifiedBy" minOccurs="0" maxOccurs="1" type="xsd:string"/>
-        <xsd:element ref="dcterms:modified" minOccurs="0" maxOccurs="1"/>
-        <xsd:element name="contentStatus" minOccurs="0" maxOccurs="1" type="xsd:string"/>
-      </xsd:all>
-    </xsd:complexType>
-  </xsd:schema>
-  <xs:schema xmlns:pc="http://schemas.microsoft.com/office/infopath/2007/PartnerControls" xmlns:xs="http://www.w3.org/2001/XMLSchema" targetNamespace="http://schemas.microsoft.com/office/infopath/2007/PartnerControls" elementFormDefault="qualified" attributeFormDefault="unqualified">
-    <xs:element name="Person">
-      <xs:complexType>
-        <xs:sequence>
-          <xs:element ref="pc:DisplayName" minOccurs="0"/>
-          <xs:element ref="pc:AccountId" minOccurs="0"/>
-          <xs:element ref="pc:AccountType" minOccurs="0"/>
-        </xs:sequence>
-      </xs:complexType>
-    </xs:element>
-    <xs:element name="DisplayName" type="xs:string"/>
-    <xs:element name="AccountId" type="xs:string"/>
-    <xs:element name="AccountType" type="xs:string"/>
-    <xs:element name="BDCAssociatedEntity">
-      <xs:complexType>
-        <xs:sequence>
-          <xs:element ref="pc:BDCEntity" minOccurs="0" maxOccurs="unbounded"/>
-        </xs:sequence>
-        <xs:attribute ref="pc:EntityNamespace"/>
-        <xs:attribute ref="pc:EntityName"/>
-        <xs:attribute ref="pc:SystemInstanceName"/>
-        <xs:attribute ref="pc:AssociationName"/>
-      </xs:complexType>
-    </xs:element>
-    <xs:attribute name="EntityNamespace" type="xs:string"/>
-    <xs:attribute name="EntityName" type="xs:string"/>
-    <xs:attribute name="SystemInstanceName" type="xs:string"/>
-    <xs:attribute name="AssociationName" type="xs:string"/>
-    <xs:element name="BDCEntity">
-      <xs:complexType>
-        <xs:sequence>
-          <xs:element ref="pc:EntityDisplayName" minOccurs="0"/>
-          <xs:element ref="pc:EntityInstanceReference" minOccurs="0"/>
-          <xs:element ref="pc:EntityId1" minOccurs="0"/>
-          <xs:element ref="pc:EntityId2" minOccurs="0"/>
-          <xs:element ref="pc:EntityId3" minOccurs="0"/>
-          <xs:element ref="pc:EntityId4" minOccurs="0"/>
-          <xs:element ref="pc:EntityId5" minOccurs="0"/>
-        </xs:sequence>
-      </xs:complexType>
-    </xs:element>
-    <xs:element name="EntityDisplayName" type="xs:string"/>
-    <xs:element name="EntityInstanceReference" type="xs:string"/>
-    <xs:element name="EntityId1" type="xs:string"/>
-    <xs:element name="EntityId2" type="xs:string"/>
-    <xs:element name="EntityId3" type="xs:string"/>
-    <xs:element name="EntityId4" type="xs:string"/>
-    <xs:element name="EntityId5" type="xs:string"/>
-    <xs:element name="Terms">
-      <xs:complexType>
-        <xs:sequence>
-          <xs:element ref="pc:TermInfo" minOccurs="0" maxOccurs="unbounded"/>
-        </xs:sequence>
-      </xs:complexType>
-    </xs:element>
-    <xs:element name="TermInfo">
-      <xs:complexType>
-        <xs:sequence>
-          <xs:element ref="pc:TermName" minOccurs="0"/>
-          <xs:element ref="pc:TermId" minOccurs="0"/>
-        </xs:sequence>
-      </xs:complexType>
-    </xs:element>
-    <xs:element name="TermName" type="xs:string"/>
-    <xs:element name="TermId" type="xs:string"/>
-  </xs:schema>
-</ct:contentTypeSchema>
-</file>
-
-<file path=customXml/item2.xml><?xml version="1.0" encoding="utf-8"?>
-<?mso-contentType ?>
-<FormTemplates xmlns="http://schemas.microsoft.com/sharepoint/v3/contenttype/forms">
-  <Display>DocumentLibraryForm</Display>
-  <Edit>DocumentLibraryForm</Edit>
-  <New>DocumentLibraryForm</New>
-</FormTemplates>
-</file>
-
-<file path=customXml/item3.xml><?xml version="1.0" encoding="utf-8"?>
-<p:properties xmlns:p="http://schemas.microsoft.com/office/2006/metadata/properties" xmlns:xsi="http://www.w3.org/2001/XMLSchema-instance" xmlns:pc="http://schemas.microsoft.com/office/infopath/2007/PartnerControls">
-  <documentManagement/>
-</p:properties>
-</file>
-
-<file path=customXml/itemProps1.xml><?xml version="1.0" encoding="utf-8"?>
-<ds:datastoreItem xmlns:ds="http://schemas.openxmlformats.org/officeDocument/2006/customXml" ds:itemID="{BA00BFEC-8FF2-4EEC-AA87-9CD68CF7C09A}"/>
-</file>
-
-<file path=customXml/itemProps2.xml><?xml version="1.0" encoding="utf-8"?>
-<ds:datastoreItem xmlns:ds="http://schemas.openxmlformats.org/officeDocument/2006/customXml" ds:itemID="{21D31CE3-659F-4935-99A1-C1BDDF5D8F49}">
-  <ds:schemaRefs>
-    <ds:schemaRef ds:uri="http://schemas.microsoft.com/sharepoint/v3/contenttype/forms"/>
-  </ds:schemaRefs>
-</ds:datastoreItem>
-</file>
-
-<file path=customXml/itemProps3.xml><?xml version="1.0" encoding="utf-8"?>
-<ds:datastoreItem xmlns:ds="http://schemas.openxmlformats.org/officeDocument/2006/customXml" ds:itemID="{A030DFCE-F006-4C10-94D2-B56A2FE44F37}">
-  <ds:schemaRefs>
-    <ds:schemaRef ds:uri="http://schemas.microsoft.com/office/2006/metadata/properties"/>
-    <ds:schemaRef ds:uri="http://schemas.microsoft.com/office/2006/documentManagement/types"/>
-    <ds:schemaRef ds:uri="http://purl.org/dc/terms/"/>
-    <ds:schemaRef ds:uri="http://purl.org/dc/elements/1.1/"/>
-    <ds:schemaRef ds:uri="http://purl.org/dc/dcmitype/"/>
-    <ds:schemaRef ds:uri="http://schemas.microsoft.com/office/infopath/2007/PartnerControls"/>
-    <ds:schemaRef ds:uri="b94d903d-1cee-4c3a-abd3-1183df9b5325"/>
-    <ds:schemaRef ds:uri="http://schemas.openxmlformats.org/package/2006/metadata/core-properties"/>
-    <ds:schemaRef ds:uri="http://www.w3.org/XML/1998/namespace"/>
-  </ds:schemaRefs>
-</ds:datastoreItem>
+<file path=word\webSettings.xml><?xml version="1.0" encoding="utf-8"?>
+<w:webSettings xmlns:mc="http://schemas.openxmlformats.org/markup-compatibility/2006" xmlns:r="http://schemas.openxmlformats.org/officeDocument/2006/relationships" xmlns:w="http://schemas.openxmlformats.org/wordprocessingml/2006/main" xmlns:w14="http://schemas.microsoft.com/office/word/2010/wordml" xmlns:w15="http://schemas.microsoft.com/office/word/2012/wordml" xmlns:w16cex="http://schemas.microsoft.com/office/word/2018/wordml/cex" xmlns:w16cid="http://schemas.microsoft.com/office/word/2016/wordml/cid" xmlns:w16="http://schemas.microsoft.com/office/word/2018/wordml" xmlns:w16du="http://schemas.microsoft.com/office/word/2023/wordml/word16du" xmlns:w16sdtdh="http://schemas.microsoft.com/office/word/2020/wordml/sdtdatahash" xmlns:w16sdtfl="http://schemas.microsoft.com/office/word/2024/wordml/sdtformatlock" xmlns:w16se="http://schemas.microsoft.com/office/word/2015/wordml/symex" mc:Ignorable="w14 w15 w16se w16cid w16 w16cex w16sdtdh w16sdtfl w16du">
+  <w:optimizeForBrowser/>
+  <w:allowPNG/>
+</w:webSettings>
 </file>
</xml_diff>